<commit_message>
fix(Web/PR2): rename folder to PW2ТВ-43 and add GitHub link to report
Rename PR2 → PW2ТВ-43_СтепаненкоНА per instructor naming convention.
Add GitHub repository link to report title page as required.
</commit_message>
<xml_diff>
--- a/Year-2/Semester-2/Web/PR/PR2/Звіт_ПР2.docx
+++ b/Year-2/Semester-2/Web/PR/PR2/Звіт_ПР2.docx
@@ -207,6 +207,26 @@
           <w:sz w:val="28"/>
         </w:rPr>
         <w:t>2025</w:t>
+      </w:r>
+    </w:p>
+    <w:p>
+      <w:pPr>
+        <w:ind w:left="4535"/>
+      </w:pPr>
+      <w:r>
+        <w:rPr>
+          <w:rFonts w:ascii="Times New Roman" w:hAnsi="Times New Roman"/>
+          <w:b/>
+          <w:sz w:val="28"/>
+        </w:rPr>
+        <w:t xml:space="preserve">GitHub: </w:t>
+      </w:r>
+      <w:r>
+        <w:rPr>
+          <w:rFonts w:ascii="Times New Roman" w:hAnsi="Times New Roman"/>
+          <w:sz w:val="24"/>
+        </w:rPr>
+        <w:t>https://github.com/d3Par1/University-Repository</w:t>
       </w:r>
     </w:p>
     <w:p/>

</xml_diff>

<commit_message>
fix(Web/PR2): add screenshots, fix name to Юрійович, year to 2025/2026
</commit_message>
<xml_diff>
--- a/Year-2/Semester-2/Web/PR/PR2/Звіт_ПР2.docx
+++ b/Year-2/Semester-2/Web/PR/PR2/Звіт_ПР2.docx
@@ -239,7 +239,7 @@
           <w:i w:val="0"/>
           <w:sz w:val="32"/>
         </w:rPr>
-        <w:t>Степаненко Назар Андрійович</w:t>
+        <w:t>Степаненко Назар Юрійович</w:t>
       </w:r>
     </w:p>
     <w:p>
@@ -338,7 +338,7 @@
           <w:i w:val="0"/>
           <w:sz w:val="32"/>
         </w:rPr>
-        <w:t>Київ 2024/2025</w:t>
+        <w:t>Київ 2025/2026</w:t>
       </w:r>
     </w:p>
     <w:p>
@@ -1396,6 +1396,126 @@
     <w:p>
       <w:pPr>
         <w:spacing w:after="0"/>
+        <w:jc w:val="center"/>
+      </w:pPr>
+      <w:r>
+        <w:drawing>
+          <wp:inline xmlns:a="http://schemas.openxmlformats.org/drawingml/2006/main" xmlns:pic="http://schemas.openxmlformats.org/drawingml/2006/picture">
+            <wp:extent cx="5760000" cy="3240000"/>
+            <wp:docPr id="1" name="Picture 1"/>
+            <wp:cNvGraphicFramePr>
+              <a:graphicFrameLocks noChangeAspect="1"/>
+            </wp:cNvGraphicFramePr>
+            <a:graphic>
+              <a:graphicData uri="http://schemas.openxmlformats.org/drawingml/2006/picture">
+                <pic:pic>
+                  <pic:nvPicPr>
+                    <pic:cNvPr id="0" name="hero_section.png"/>
+                    <pic:cNvPicPr/>
+                  </pic:nvPicPr>
+                  <pic:blipFill>
+                    <a:blip r:embed="rId9"/>
+                    <a:stretch>
+                      <a:fillRect/>
+                    </a:stretch>
+                  </pic:blipFill>
+                  <pic:spPr>
+                    <a:xfrm>
+                      <a:off x="0" y="0"/>
+                      <a:ext cx="5760000" cy="3240000"/>
+                    </a:xfrm>
+                    <a:prstGeom prst="rect"/>
+                  </pic:spPr>
+                </pic:pic>
+              </a:graphicData>
+            </a:graphic>
+          </wp:inline>
+        </w:drawing>
+      </w:r>
+    </w:p>
+    <w:p>
+      <w:pPr>
+        <w:spacing w:after="0"/>
+        <w:jc w:val="center"/>
+      </w:pPr>
+      <w:r>
+        <w:rPr>
+          <w:rFonts w:ascii="Times New Roman" w:hAnsi="Times New Roman"/>
+          <w:b w:val="0"/>
+          <w:i/>
+          <w:sz w:val="24"/>
+        </w:rPr>
+        <w:t>Рис. 1. Hero-секція та панель керування (desktop, 1920×1080)</w:t>
+      </w:r>
+    </w:p>
+    <w:p>
+      <w:pPr>
+        <w:spacing w:after="0"/>
+      </w:pPr>
+    </w:p>
+    <w:p>
+      <w:pPr>
+        <w:spacing w:after="0"/>
+        <w:jc w:val="center"/>
+      </w:pPr>
+      <w:r>
+        <w:drawing>
+          <wp:inline xmlns:a="http://schemas.openxmlformats.org/drawingml/2006/main" xmlns:pic="http://schemas.openxmlformats.org/drawingml/2006/picture">
+            <wp:extent cx="5760000" cy="3240000"/>
+            <wp:docPr id="2" name="Picture 2"/>
+            <wp:cNvGraphicFramePr>
+              <a:graphicFrameLocks noChangeAspect="1"/>
+            </wp:cNvGraphicFramePr>
+            <a:graphic>
+              <a:graphicData uri="http://schemas.openxmlformats.org/drawingml/2006/picture">
+                <pic:pic>
+                  <pic:nvPicPr>
+                    <pic:cNvPr id="0" name="dashboard.png"/>
+                    <pic:cNvPicPr/>
+                  </pic:nvPicPr>
+                  <pic:blipFill>
+                    <a:blip r:embed="rId10"/>
+                    <a:stretch>
+                      <a:fillRect/>
+                    </a:stretch>
+                  </pic:blipFill>
+                  <pic:spPr>
+                    <a:xfrm>
+                      <a:off x="0" y="0"/>
+                      <a:ext cx="5760000" cy="3240000"/>
+                    </a:xfrm>
+                    <a:prstGeom prst="rect"/>
+                  </pic:spPr>
+                </pic:pic>
+              </a:graphicData>
+            </a:graphic>
+          </wp:inline>
+        </w:drawing>
+      </w:r>
+    </w:p>
+    <w:p>
+      <w:pPr>
+        <w:spacing w:after="0"/>
+        <w:jc w:val="center"/>
+      </w:pPr>
+      <w:r>
+        <w:rPr>
+          <w:rFonts w:ascii="Times New Roman" w:hAnsi="Times New Roman"/>
+          <w:b w:val="0"/>
+          <w:i/>
+          <w:sz w:val="24"/>
+        </w:rPr>
+        <w:t>Рис. 2. Дашборд параметрів, додаткові індикатори та графіки</w:t>
+      </w:r>
+    </w:p>
+    <w:p>
+      <w:pPr>
+        <w:spacing w:after="0"/>
+      </w:pPr>
+    </w:p>
+    <w:p>
+      <w:pPr>
+        <w:spacing w:after="0"/>
       </w:pPr>
       <w:r>
         <w:rPr>
@@ -1457,6 +1577,66 @@
     <w:p>
       <w:pPr>
         <w:spacing w:after="0"/>
+        <w:jc w:val="center"/>
+      </w:pPr>
+      <w:r>
+        <w:drawing>
+          <wp:inline xmlns:a="http://schemas.openxmlformats.org/drawingml/2006/main" xmlns:pic="http://schemas.openxmlformats.org/drawingml/2006/picture">
+            <wp:extent cx="5760000" cy="3240000"/>
+            <wp:docPr id="3" name="Picture 3"/>
+            <wp:cNvGraphicFramePr>
+              <a:graphicFrameLocks noChangeAspect="1"/>
+            </wp:cNvGraphicFramePr>
+            <a:graphic>
+              <a:graphicData uri="http://schemas.openxmlformats.org/drawingml/2006/picture">
+                <pic:pic>
+                  <pic:nvPicPr>
+                    <pic:cNvPr id="0" name="charts.png"/>
+                    <pic:cNvPicPr/>
+                  </pic:nvPicPr>
+                  <pic:blipFill>
+                    <a:blip r:embed="rId11"/>
+                    <a:stretch>
+                      <a:fillRect/>
+                    </a:stretch>
+                  </pic:blipFill>
+                  <pic:spPr>
+                    <a:xfrm>
+                      <a:off x="0" y="0"/>
+                      <a:ext cx="5760000" cy="3240000"/>
+                    </a:xfrm>
+                    <a:prstGeom prst="rect"/>
+                  </pic:spPr>
+                </pic:pic>
+              </a:graphicData>
+            </a:graphic>
+          </wp:inline>
+        </w:drawing>
+      </w:r>
+    </w:p>
+    <w:p>
+      <w:pPr>
+        <w:spacing w:after="0"/>
+        <w:jc w:val="center"/>
+      </w:pPr>
+      <w:r>
+        <w:rPr>
+          <w:rFonts w:ascii="Times New Roman" w:hAnsi="Times New Roman"/>
+          <w:b w:val="0"/>
+          <w:i/>
+          <w:sz w:val="24"/>
+        </w:rPr>
+        <w:t>Рис. 3. Графіки Chart.js — історія 4-х параметрів</w:t>
+      </w:r>
+    </w:p>
+    <w:p>
+      <w:pPr>
+        <w:spacing w:after="0"/>
+      </w:pPr>
+    </w:p>
+    <w:p>
+      <w:pPr>
+        <w:spacing w:after="0"/>
       </w:pPr>
       <w:r>
         <w:rPr>
@@ -1480,6 +1660,126 @@
           <w:sz w:val="28"/>
         </w:rPr>
         <w:t>Журнал вимірювань зберігається в localStorage та експортується в CSV.</w:t>
+      </w:r>
+    </w:p>
+    <w:p>
+      <w:pPr>
+        <w:spacing w:after="0"/>
+      </w:pPr>
+    </w:p>
+    <w:p>
+      <w:pPr>
+        <w:spacing w:after="0"/>
+        <w:jc w:val="center"/>
+      </w:pPr>
+      <w:r>
+        <w:drawing>
+          <wp:inline xmlns:a="http://schemas.openxmlformats.org/drawingml/2006/main" xmlns:pic="http://schemas.openxmlformats.org/drawingml/2006/picture">
+            <wp:extent cx="5760000" cy="3240000"/>
+            <wp:docPr id="4" name="Picture 4"/>
+            <wp:cNvGraphicFramePr>
+              <a:graphicFrameLocks noChangeAspect="1"/>
+            </wp:cNvGraphicFramePr>
+            <a:graphic>
+              <a:graphicData uri="http://schemas.openxmlformats.org/drawingml/2006/picture">
+                <pic:pic>
+                  <pic:nvPicPr>
+                    <pic:cNvPr id="0" name="log_table.png"/>
+                    <pic:cNvPicPr/>
+                  </pic:nvPicPr>
+                  <pic:blipFill>
+                    <a:blip r:embed="rId12"/>
+                    <a:stretch>
+                      <a:fillRect/>
+                    </a:stretch>
+                  </pic:blipFill>
+                  <pic:spPr>
+                    <a:xfrm>
+                      <a:off x="0" y="0"/>
+                      <a:ext cx="5760000" cy="3240000"/>
+                    </a:xfrm>
+                    <a:prstGeom prst="rect"/>
+                  </pic:spPr>
+                </pic:pic>
+              </a:graphicData>
+            </a:graphic>
+          </wp:inline>
+        </w:drawing>
+      </w:r>
+    </w:p>
+    <w:p>
+      <w:pPr>
+        <w:spacing w:after="0"/>
+        <w:jc w:val="center"/>
+      </w:pPr>
+      <w:r>
+        <w:rPr>
+          <w:rFonts w:ascii="Times New Roman" w:hAnsi="Times New Roman"/>
+          <w:b w:val="0"/>
+          <w:i/>
+          <w:sz w:val="24"/>
+        </w:rPr>
+        <w:t>Рис. 4. Журнал вимірювань з експортом CSV</w:t>
+      </w:r>
+    </w:p>
+    <w:p>
+      <w:pPr>
+        <w:spacing w:after="0"/>
+      </w:pPr>
+    </w:p>
+    <w:p>
+      <w:pPr>
+        <w:spacing w:after="0"/>
+        <w:jc w:val="center"/>
+      </w:pPr>
+      <w:r>
+        <w:drawing>
+          <wp:inline xmlns:a="http://schemas.openxmlformats.org/drawingml/2006/main" xmlns:pic="http://schemas.openxmlformats.org/drawingml/2006/picture">
+            <wp:extent cx="2880000" cy="5122560"/>
+            <wp:docPr id="5" name="Picture 5"/>
+            <wp:cNvGraphicFramePr>
+              <a:graphicFrameLocks noChangeAspect="1"/>
+            </wp:cNvGraphicFramePr>
+            <a:graphic>
+              <a:graphicData uri="http://schemas.openxmlformats.org/drawingml/2006/picture">
+                <pic:pic>
+                  <pic:nvPicPr>
+                    <pic:cNvPr id="0" name="mobile.png"/>
+                    <pic:cNvPicPr/>
+                  </pic:nvPicPr>
+                  <pic:blipFill>
+                    <a:blip r:embed="rId13"/>
+                    <a:stretch>
+                      <a:fillRect/>
+                    </a:stretch>
+                  </pic:blipFill>
+                  <pic:spPr>
+                    <a:xfrm>
+                      <a:off x="0" y="0"/>
+                      <a:ext cx="2880000" cy="5122560"/>
+                    </a:xfrm>
+                    <a:prstGeom prst="rect"/>
+                  </pic:spPr>
+                </pic:pic>
+              </a:graphicData>
+            </a:graphic>
+          </wp:inline>
+        </w:drawing>
+      </w:r>
+    </w:p>
+    <w:p>
+      <w:pPr>
+        <w:spacing w:after="0"/>
+        <w:jc w:val="center"/>
+      </w:pPr>
+      <w:r>
+        <w:rPr>
+          <w:rFonts w:ascii="Times New Roman" w:hAnsi="Times New Roman"/>
+          <w:b w:val="0"/>
+          <w:i/>
+          <w:sz w:val="24"/>
+        </w:rPr>
+        <w:t>Рис. 5. Мобільна версія (375×667)</w:t>
       </w:r>
     </w:p>
     <w:p>

</xml_diff>